<commit_message>
Restore index tower data, fix dashboard build, final report
</commit_message>
<xml_diff>
--- a/Documents/DataChallenge_Team 10_Report.docx
+++ b/Documents/DataChallenge_Team 10_Report.docx
@@ -856,7 +856,7 @@
           <w:noProof/>
         </w:rPr>
         <w:drawing>
-          <wp:inline distT="0" distB="0" distL="0" distR="0" wp14:anchorId="2E6394AD" wp14:editId="3D4B72B6">
+          <wp:inline distT="0" distB="0" distL="0" distR="0" wp14:anchorId="72BF9195" wp14:editId="3A40FBA3">
             <wp:extent cx="3780000" cy="4769551"/>
             <wp:effectExtent l="0" t="0" r="0" b="0"/>
             <wp:docPr id="1" name="Picture 1"/>
@@ -966,10 +966,10 @@
           <w:noProof/>
         </w:rPr>
         <w:drawing>
-          <wp:inline distT="0" distB="0" distL="0" distR="0" wp14:anchorId="127C7CFF" wp14:editId="4CD4040C">
+          <wp:inline distT="0" distB="0" distL="0" distR="0" wp14:anchorId="6A027574" wp14:editId="7B60C9CA">
             <wp:extent cx="4860000" cy="3301211"/>
             <wp:effectExtent l="0" t="0" r="0" b="0"/>
-            <wp:docPr id="1493027969" name="Picture 1493027969"/>
+            <wp:docPr id="860318360" name="Picture 860318360"/>
             <wp:cNvGraphicFramePr>
               <a:graphicFrameLocks xmlns:a="http://schemas.openxmlformats.org/drawingml/2006/main" noChangeAspect="1"/>
             </wp:cNvGraphicFramePr>
@@ -1073,10 +1073,10 @@
         </w:rPr>
         <w:lastRenderedPageBreak/>
         <w:drawing>
-          <wp:inline distT="0" distB="0" distL="0" distR="0" wp14:anchorId="7CAC3026" wp14:editId="74C0224E">
+          <wp:inline distT="0" distB="0" distL="0" distR="0" wp14:anchorId="4B2A44BE" wp14:editId="2F9BF854">
             <wp:extent cx="3420000" cy="2461349"/>
             <wp:effectExtent l="0" t="0" r="0" b="0"/>
-            <wp:docPr id="147483264" name="Picture 147483264"/>
+            <wp:docPr id="1575047520" name="Picture 1575047520"/>
             <wp:cNvGraphicFramePr>
               <a:graphicFrameLocks xmlns:a="http://schemas.openxmlformats.org/drawingml/2006/main" noChangeAspect="1"/>
             </wp:cNvGraphicFramePr>
@@ -1173,7 +1173,7 @@
         <w:spacing w:after="120" w:line="264" w:lineRule="auto"/>
       </w:pPr>
       <w:r>
-        <w:t>The offline-first reporting app (Warning_Blackspot_App_Source_Code) shows how people in low-connectivity communities could report local hazards. Its home screen shows the current fire danger level, nearby hazards and a local map. A trusted community representative can report dry or tall grass, smoke, fire or floodwater by choosing an icon, taking a photo, adding notes and recording the GPS location, in English or Murrinh Patha with audio guidance. Without signal, the report is saved on the device in browser LocalStorage with the status "queued"; when a connection returns, the app syncs it to a Cloudflare D1 database and marks it "synced". The app is a proof of concept, not an official warning service: a production version would need user testing, secure accounts, privacy protection and agreement with communities and agencies.</w:t>
+        <w:t>The offline-first reporting app (Warning_Blackspot_App_Source_Code) shows how people in low-connectivity communities could report local hazards. Its home screen shows the current fire danger level, nearby hazards and a local map. A trusted community representative can report dry or tall grass, smoke, fire or floodwater by choosing an icon, taking a photo, adding notes and recording the GPS location, in English or Murrinh Patha with audio guidance. Without signal, the report is saved on the device in browser LocalStorage with the status "queued"; when a connection returns, the app syncs it to a Cloudflare D1 database and marks it "synced". A native Android and iOS version (mobile/, React Native with Expo) follows the same offline-first flow: it stores reports on the device, detects when connectivity returns, and uploads them to a small reports API that the dashboard displays on its Field Reports page. Both are proofs of concept, not official warning services: a production version would need user testing, secure accounts, privacy protection and agreement with communities and agencies.</w:t>
       </w:r>
     </w:p>
     <w:p>
@@ -1284,10 +1284,10 @@
           <w:b/>
           <w:bCs/>
         </w:rPr>
-        <w:t xml:space="preserve">Prototype application. </w:t>
-      </w:r>
-      <w:r>
-        <w:t>The offline app is not an official emergency warning service, and a production version would need to say so clearly. Several privacy issues would need to be resolved before real use:</w:t>
+        <w:t xml:space="preserve">Prototype applications. </w:t>
+      </w:r>
+      <w:r>
+        <w:t>The offline apps are not an official emergency warning service, and a production version would need to say so clearly. Several privacy issues would need to be resolved before real use:</w:t>
       </w:r>
     </w:p>
     <w:p>
@@ -1313,7 +1313,7 @@
         <w:spacing w:after="60" w:line="264" w:lineRule="auto"/>
       </w:pPr>
       <w:r>
-        <w:t>Queued reports are held in browser LocalStorage, which is not encrypted, so a shared or lost device could expose them.</w:t>
+        <w:t>Queued reports are held in browser LocalStorage or on-device app storage, neither of which is encrypted, so a shared or lost device could expose them.</w:t>
       </w:r>
     </w:p>
     <w:p>
@@ -1326,7 +1326,7 @@
         <w:spacing w:after="60" w:line="264" w:lineRule="auto"/>
       </w:pPr>
       <w:r>
-        <w:t>Reports sync to a cloud database (Cloudflare D1). A real deployment would need secure accounts, access controls, a retention policy and a decision on where data is held.</w:t>
+        <w:t>Reports sync to a cloud database (Cloudflare D1) or to the reports API. A real deployment would need secure accounts, access controls, a retention policy and a decision on where data is held.</w:t>
       </w:r>
     </w:p>
     <w:p>
@@ -1370,27 +1370,6 @@
       </w:r>
       <w:r>
         <w:t>AI tools used in this project, the tasks they supported and how their output was checked are declared in Appendix B.</w:t>
-      </w:r>
-    </w:p>
-    <w:p>
-      <w:pPr>
-        <w:rPr>
-          <w:b/>
-          <w:bCs/>
-          <w:color w:val="000000"/>
-          <w:sz w:val="28"/>
-          <w:szCs w:val="28"/>
-        </w:rPr>
-      </w:pPr>
-      <w:r>
-        <w:rPr>
-          <w:b/>
-          <w:bCs/>
-          <w:color w:val="000000"/>
-          <w:sz w:val="28"/>
-          <w:szCs w:val="28"/>
-        </w:rPr>
-        <w:br w:type="page"/>
       </w:r>
     </w:p>
     <w:p>
@@ -2696,6 +2675,10 @@
           </w:tcPr>
           <w:p>
             <w:r>
+              <w:rPr>
+                <w:sz w:val="20"/>
+                <w:szCs w:val="20"/>
+              </w:rPr>
               <w:t>Gemini, ChatGPT, Claude, Deepseek</w:t>
             </w:r>
           </w:p>
@@ -2748,21 +2731,21 @@
                 <w:sz w:val="20"/>
                 <w:szCs w:val="20"/>
               </w:rPr>
-              <w:t>The team re-ran the pipeline, compared every number in the report and slides,</w:t>
-            </w:r>
-            <w:r>
-              <w:rPr>
-                <w:sz w:val="20"/>
-                <w:szCs w:val="20"/>
-              </w:rPr>
-              <w:t xml:space="preserve"> then</w:t>
-            </w:r>
-            <w:r>
-              <w:rPr>
-                <w:sz w:val="20"/>
-                <w:szCs w:val="20"/>
-              </w:rPr>
-              <w:t xml:space="preserve"> reviewed and edited all text</w:t>
+              <w:t xml:space="preserve">The team re-ran the pipeline, compared every number in the report and </w:t>
+            </w:r>
+            <w:r>
+              <w:rPr>
+                <w:sz w:val="20"/>
+                <w:szCs w:val="20"/>
+              </w:rPr>
+              <w:t>slides</w:t>
+            </w:r>
+            <w:r>
+              <w:rPr>
+                <w:sz w:val="20"/>
+                <w:szCs w:val="20"/>
+              </w:rPr>
+              <w:t>, and reviewed and edited all text</w:t>
             </w:r>
           </w:p>
         </w:tc>
@@ -2790,7 +2773,7 @@
         <w:spacing w:after="120" w:line="264" w:lineRule="auto"/>
       </w:pPr>
       <w:r>
-        <w:t>Repository: https://github.com/HendrickDang/nt-warning-blackspot-index. The index is computed by Bushfire_analysis/wbi_index.py, the descriptive figures by Bushfire_analysis/bushfire_analysis.py, and the slide figures by Bushfire_analysis/slide_figures.py. To reproduce: pip install -r Bushfire_analysis/requirements.txt, then python Bushfire_analysis/wbi_index.py. Outputs are written to Bushfire_analysis/outputs/, and the dashboard in connectivity-dashboard1/ reads the same results. The offline reporting app is in Warning_Blackspot_App_Source_Code/. Full instructions are in README.md.</w:t>
+        <w:t>Repository: https://github.com/HendrickDang/nt-warning-blackspot-index. The index is computed by Bushfire_analysis/wbi_index.py, the descriptive figures by Bushfire_analysis/bushfire_analysis.py, and the slide figures by Bushfire_analysis/slide_figures.py. To reproduce: pip install -r Bushfire_analysis/requirements.txt, then python Bushfire_analysis/wbi_index.py. Outputs are written to Bushfire_analysis/outputs/, and the dashboard in connectivity-dashboard1/ reads the same results. The offline reporting web app is in Warning_Blackspot_App_Source_Code/, the native mobile app in mobile/, and the field reports API in connectivity-dashboard1/server/. Full instructions are in README.md.</w:t>
       </w:r>
     </w:p>
     <w:p>
@@ -2829,10 +2812,10 @@
           <w:noProof/>
         </w:rPr>
         <w:drawing>
-          <wp:inline distT="0" distB="0" distL="0" distR="0" wp14:anchorId="09F0F7F6" wp14:editId="7C6541F3">
-            <wp:extent cx="5580000" cy="4211716"/>
-            <wp:effectExtent l="0" t="0" r="0" b="0"/>
-            <wp:docPr id="1172927694" name="Picture 1172927694"/>
+          <wp:inline distT="0" distB="0" distL="0" distR="0" wp14:anchorId="0D92770D" wp14:editId="5706C205">
+            <wp:extent cx="5312775" cy="4010018"/>
+            <wp:effectExtent l="0" t="0" r="2540" b="0"/>
+            <wp:docPr id="115947269" name="Picture 115947269"/>
             <wp:cNvGraphicFramePr>
               <a:graphicFrameLocks xmlns:a="http://schemas.openxmlformats.org/drawingml/2006/main" noChangeAspect="1"/>
             </wp:cNvGraphicFramePr>
@@ -2855,7 +2838,7 @@
                   <pic:spPr bwMode="auto">
                     <a:xfrm>
                       <a:off x="0" y="0"/>
-                      <a:ext cx="5580000" cy="4211716"/>
+                      <a:ext cx="5319114" cy="4014803"/>
                     </a:xfrm>
                     <a:prstGeom prst="rect">
                       <a:avLst/>
@@ -2871,6 +2854,7 @@
     <w:p>
       <w:pPr>
         <w:spacing w:after="200"/>
+        <w:jc w:val="center"/>
       </w:pPr>
       <w:r>
         <w:rPr>
@@ -3127,10 +3111,10 @@
 <file path=word/numbering.xml><?xml version="1.0" encoding="utf-8"?>
 <w:numbering xmlns:wpc="http://schemas.microsoft.com/office/word/2010/wordprocessingCanvas" xmlns:cx="http://schemas.microsoft.com/office/drawing/2014/chartex" xmlns:cx1="http://schemas.microsoft.com/office/drawing/2015/9/8/chartex" xmlns:cx2="http://schemas.microsoft.com/office/drawing/2015/10/21/chartex" xmlns:cx3="http://schemas.microsoft.com/office/drawing/2016/5/9/chartex" xmlns:cx4="http://schemas.microsoft.com/office/drawing/2016/5/10/chartex" xmlns:cx5="http://schemas.microsoft.com/office/drawing/2016/5/11/chartex" xmlns:cx6="http://schemas.microsoft.com/office/drawing/2016/5/12/chartex" xmlns:cx7="http://schemas.microsoft.com/office/drawing/2016/5/13/chartex" xmlns:cx8="http://schemas.microsoft.com/office/drawing/2016/5/14/chartex" xmlns:mc="http://schemas.openxmlformats.org/markup-compatibility/2006" xmlns:aink="http://schemas.microsoft.com/office/drawing/2016/ink" xmlns:am3d="http://schemas.microsoft.com/office/drawing/2017/model3d" xmlns:o="urn:schemas-microsoft-com:office:office" xmlns:oel="http://schemas.microsoft.com/office/2019/extlst" xmlns:r="http://schemas.openxmlformats.org/officeDocument/2006/relationships" xmlns:m="http://schemas.openxmlformats.org/officeDocument/2006/math" xmlns:v="urn:schemas-microsoft-com:vml" xmlns:wp14="http://schemas.microsoft.com/office/word/2010/wordprocessingDrawing" xmlns:wp="http://schemas.openxmlformats.org/drawingml/2006/wordprocessingDrawing" xmlns:w10="urn:schemas-microsoft-com:office:word" xmlns:w="http://schemas.openxmlformats.org/wordprocessingml/2006/main" xmlns:w14="http://schemas.microsoft.com/office/word/2010/wordml" xmlns:w15="http://schemas.microsoft.com/office/word/2012/wordml" xmlns:w16cex="http://schemas.microsoft.com/office/word/2018/wordml/cex" xmlns:w16cid="http://schemas.microsoft.com/office/word/2016/wordml/cid" xmlns:w16="http://schemas.microsoft.com/office/word/2018/wordml" xmlns:w16du="http://schemas.microsoft.com/office/word/2023/wordml/word16du" xmlns:w16sdtdh="http://schemas.microsoft.com/office/word/2020/wordml/sdtdatahash" xmlns:w16sdtfl="http://schemas.microsoft.com/office/word/2024/wordml/sdtformatlock" xmlns:w16se="http://schemas.microsoft.com/office/word/2015/wordml/symex" xmlns:wpg="http://schemas.microsoft.com/office/word/2010/wordprocessingGroup" xmlns:wpi="http://schemas.microsoft.com/office/word/2010/wordprocessingInk" xmlns:wne="http://schemas.microsoft.com/office/word/2006/wordml" xmlns:wps="http://schemas.microsoft.com/office/word/2010/wordprocessingShape" mc:Ignorable="w14 w15 w16se w16cid w16 w16cex w16sdtdh w16sdtfl w16du wp14">
   <w:abstractNum w:abstractNumId="0" w15:restartNumberingAfterBreak="0">
-    <w:nsid w:val="385565AE"/>
+    <w:nsid w:val="2E261440"/>
     <w:multiLevelType w:val="hybridMultilevel"/>
-    <w:tmpl w:val="29E22950"/>
-    <w:lvl w:ilvl="0" w:tplc="709C859A">
+    <w:tmpl w:val="12941FD6"/>
+    <w:lvl w:ilvl="0" w:tplc="C840D66C">
       <w:start w:val="1"/>
       <w:numFmt w:val="bullet"/>
       <w:lvlText w:val="•"/>
@@ -3139,52 +3123,52 @@
         <w:ind w:left="720" w:hanging="360"/>
       </w:pPr>
     </w:lvl>
-    <w:lvl w:ilvl="1" w:tplc="F7983ADC">
+    <w:lvl w:ilvl="1" w:tplc="81C4D1F2">
       <w:numFmt w:val="decimal"/>
       <w:lvlText w:val=""/>
       <w:lvlJc w:val="left"/>
     </w:lvl>
-    <w:lvl w:ilvl="2" w:tplc="55F29B5E">
+    <w:lvl w:ilvl="2" w:tplc="C5721E06">
       <w:numFmt w:val="decimal"/>
       <w:lvlText w:val=""/>
       <w:lvlJc w:val="left"/>
     </w:lvl>
-    <w:lvl w:ilvl="3" w:tplc="100A8C6C">
+    <w:lvl w:ilvl="3" w:tplc="34D2CC52">
       <w:numFmt w:val="decimal"/>
       <w:lvlText w:val=""/>
       <w:lvlJc w:val="left"/>
     </w:lvl>
-    <w:lvl w:ilvl="4" w:tplc="7F5A06F4">
+    <w:lvl w:ilvl="4" w:tplc="F98C2C44">
       <w:numFmt w:val="decimal"/>
       <w:lvlText w:val=""/>
       <w:lvlJc w:val="left"/>
     </w:lvl>
-    <w:lvl w:ilvl="5" w:tplc="1F6A73CC">
+    <w:lvl w:ilvl="5" w:tplc="87FC7336">
       <w:numFmt w:val="decimal"/>
       <w:lvlText w:val=""/>
       <w:lvlJc w:val="left"/>
     </w:lvl>
-    <w:lvl w:ilvl="6" w:tplc="FD14AB1E">
+    <w:lvl w:ilvl="6" w:tplc="56FEE14A">
       <w:numFmt w:val="decimal"/>
       <w:lvlText w:val=""/>
       <w:lvlJc w:val="left"/>
     </w:lvl>
-    <w:lvl w:ilvl="7" w:tplc="35C42398">
+    <w:lvl w:ilvl="7" w:tplc="75B89AA4">
       <w:numFmt w:val="decimal"/>
       <w:lvlText w:val=""/>
       <w:lvlJc w:val="left"/>
     </w:lvl>
-    <w:lvl w:ilvl="8" w:tplc="EF4A9DC4">
+    <w:lvl w:ilvl="8" w:tplc="344E0B2A">
       <w:numFmt w:val="decimal"/>
       <w:lvlText w:val=""/>
       <w:lvlJc w:val="left"/>
     </w:lvl>
   </w:abstractNum>
   <w:abstractNum w:abstractNumId="1" w15:restartNumberingAfterBreak="0">
-    <w:nsid w:val="61A40E8F"/>
+    <w:nsid w:val="6CC1664D"/>
     <w:multiLevelType w:val="hybridMultilevel"/>
-    <w:tmpl w:val="9A1C98DA"/>
-    <w:lvl w:ilvl="0" w:tplc="70CEEEE2">
+    <w:tmpl w:val="471A4884"/>
+    <w:lvl w:ilvl="0" w:tplc="5B2AE1D0">
       <w:start w:val="1"/>
       <w:numFmt w:val="bullet"/>
       <w:lvlText w:val="●"/>
@@ -3193,7 +3177,7 @@
         <w:ind w:left="720" w:hanging="360"/>
       </w:pPr>
     </w:lvl>
-    <w:lvl w:ilvl="1" w:tplc="DA6AD5CE">
+    <w:lvl w:ilvl="1" w:tplc="7BD29068">
       <w:start w:val="1"/>
       <w:numFmt w:val="bullet"/>
       <w:lvlText w:val="○"/>
@@ -3202,7 +3186,7 @@
         <w:ind w:left="1440" w:hanging="360"/>
       </w:pPr>
     </w:lvl>
-    <w:lvl w:ilvl="2" w:tplc="F76C77EC">
+    <w:lvl w:ilvl="2" w:tplc="77BCDA8C">
       <w:start w:val="1"/>
       <w:numFmt w:val="bullet"/>
       <w:lvlText w:val="■"/>
@@ -3211,7 +3195,7 @@
         <w:ind w:left="2160" w:hanging="360"/>
       </w:pPr>
     </w:lvl>
-    <w:lvl w:ilvl="3" w:tplc="1B48E332">
+    <w:lvl w:ilvl="3" w:tplc="C964B952">
       <w:start w:val="1"/>
       <w:numFmt w:val="bullet"/>
       <w:lvlText w:val="●"/>
@@ -3220,7 +3204,7 @@
         <w:ind w:left="2880" w:hanging="360"/>
       </w:pPr>
     </w:lvl>
-    <w:lvl w:ilvl="4" w:tplc="8F008950">
+    <w:lvl w:ilvl="4" w:tplc="2B20F1A6">
       <w:start w:val="1"/>
       <w:numFmt w:val="bullet"/>
       <w:lvlText w:val="○"/>
@@ -3229,7 +3213,7 @@
         <w:ind w:left="3600" w:hanging="360"/>
       </w:pPr>
     </w:lvl>
-    <w:lvl w:ilvl="5" w:tplc="4FD0753A">
+    <w:lvl w:ilvl="5" w:tplc="26260766">
       <w:start w:val="1"/>
       <w:numFmt w:val="bullet"/>
       <w:lvlText w:val="■"/>
@@ -3238,7 +3222,7 @@
         <w:ind w:left="4320" w:hanging="360"/>
       </w:pPr>
     </w:lvl>
-    <w:lvl w:ilvl="6" w:tplc="D196E5A6">
+    <w:lvl w:ilvl="6" w:tplc="13980E02">
       <w:start w:val="1"/>
       <w:numFmt w:val="bullet"/>
       <w:lvlText w:val="●"/>
@@ -3247,7 +3231,7 @@
         <w:ind w:left="5040" w:hanging="360"/>
       </w:pPr>
     </w:lvl>
-    <w:lvl w:ilvl="7" w:tplc="CE94AA6C">
+    <w:lvl w:ilvl="7" w:tplc="AFAA8AD2">
       <w:start w:val="1"/>
       <w:numFmt w:val="bullet"/>
       <w:lvlText w:val="●"/>
@@ -3256,7 +3240,7 @@
         <w:ind w:left="5760" w:hanging="360"/>
       </w:pPr>
     </w:lvl>
-    <w:lvl w:ilvl="8" w:tplc="89E6E446">
+    <w:lvl w:ilvl="8" w:tplc="32F2DDC6">
       <w:start w:val="1"/>
       <w:numFmt w:val="bullet"/>
       <w:lvlText w:val="●"/>
@@ -3266,13 +3250,13 @@
       </w:pPr>
     </w:lvl>
   </w:abstractNum>
-  <w:num w:numId="1" w16cid:durableId="1694502461">
+  <w:num w:numId="1" w16cid:durableId="224149728">
     <w:abstractNumId w:val="1"/>
     <w:lvlOverride w:ilvl="0">
       <w:startOverride w:val="1"/>
     </w:lvlOverride>
   </w:num>
-  <w:num w:numId="2" w16cid:durableId="480971742">
+  <w:num w:numId="2" w16cid:durableId="2001078968">
     <w:abstractNumId w:val="0"/>
     <w:lvlOverride w:ilvl="0">
       <w:startOverride w:val="1"/>
@@ -3879,6 +3863,48 @@
       <w:szCs w:val="20"/>
     </w:rPr>
   </w:style>
+  <w:style w:type="paragraph" w:styleId="Header">
+    <w:name w:val="header"/>
+    <w:basedOn w:val="Normal"/>
+    <w:link w:val="HeaderChar"/>
+    <w:uiPriority w:val="99"/>
+    <w:unhideWhenUsed/>
+    <w:rsid w:val="001306BB"/>
+    <w:pPr>
+      <w:tabs>
+        <w:tab w:val="center" w:pos="4680"/>
+        <w:tab w:val="right" w:pos="9360"/>
+      </w:tabs>
+    </w:pPr>
+  </w:style>
+  <w:style w:type="character" w:customStyle="1" w:styleId="HeaderChar">
+    <w:name w:val="Header Char"/>
+    <w:basedOn w:val="DefaultParagraphFont"/>
+    <w:link w:val="Header"/>
+    <w:uiPriority w:val="99"/>
+    <w:rsid w:val="001306BB"/>
+  </w:style>
+  <w:style w:type="paragraph" w:styleId="Footer">
+    <w:name w:val="footer"/>
+    <w:basedOn w:val="Normal"/>
+    <w:link w:val="FooterChar"/>
+    <w:uiPriority w:val="99"/>
+    <w:unhideWhenUsed/>
+    <w:rsid w:val="001306BB"/>
+    <w:pPr>
+      <w:tabs>
+        <w:tab w:val="center" w:pos="4680"/>
+        <w:tab w:val="right" w:pos="9360"/>
+      </w:tabs>
+    </w:pPr>
+  </w:style>
+  <w:style w:type="character" w:customStyle="1" w:styleId="FooterChar">
+    <w:name w:val="Footer Char"/>
+    <w:basedOn w:val="DefaultParagraphFont"/>
+    <w:link w:val="Footer"/>
+    <w:uiPriority w:val="99"/>
+    <w:rsid w:val="001306BB"/>
+  </w:style>
 </w:styles>
 </file>
 

</xml_diff>